<commit_message>
Security And Ergonomic Settings.docx2
</commit_message>
<xml_diff>
--- a/Security And Ergonomic Settings.docx
+++ b/Security And Ergonomic Settings.docx
@@ -1,6 +1,6 @@
 
 <file path=word/document.xml><?xml version="1.0" encoding="utf-8"?>
-<w:document xmlns:wpc="http://schemas.microsoft.com/office/word/2010/wordprocessingCanvas" xmlns:mc="http://schemas.openxmlformats.org/markup-compatibility/2006" xmlns:o="urn:schemas-microsoft-com:office:office" xmlns:r="http://schemas.openxmlformats.org/officeDocument/2006/relationships" xmlns:m="http://schemas.openxmlformats.org/officeDocument/2006/math" xmlns:v="urn:schemas-microsoft-com:vml" xmlns:wp14="http://schemas.microsoft.com/office/word/2010/wordprocessingDrawing" xmlns:wp="http://schemas.openxmlformats.org/drawingml/2006/wordprocessingDrawing" xmlns:w10="urn:schemas-microsoft-com:office:word" xmlns:w="http://schemas.openxmlformats.org/wordprocessingml/2006/main" xmlns:w14="http://schemas.microsoft.com/office/word/2010/wordml" xmlns:w15="http://schemas.microsoft.com/office/word/2012/wordml" xmlns:wpg="http://schemas.microsoft.com/office/word/2010/wordprocessingGroup" xmlns:wpi="http://schemas.microsoft.com/office/word/2010/wordprocessingInk" xmlns:wne="http://schemas.microsoft.com/office/word/2006/wordml" xmlns:wps="http://schemas.microsoft.com/office/word/2010/wordprocessingShape" mc:Ignorable="w14 w15 wp14">
+<w:document xmlns:wpc="http://schemas.microsoft.com/office/word/2010/wordprocessingCanvas" xmlns:cx="http://schemas.microsoft.com/office/drawing/2014/chartex" xmlns:mc="http://schemas.openxmlformats.org/markup-compatibility/2006" xmlns:o="urn:schemas-microsoft-com:office:office" xmlns:r="http://schemas.openxmlformats.org/officeDocument/2006/relationships" xmlns:m="http://schemas.openxmlformats.org/officeDocument/2006/math" xmlns:v="urn:schemas-microsoft-com:vml" xmlns:wp14="http://schemas.microsoft.com/office/word/2010/wordprocessingDrawing" xmlns:wp="http://schemas.openxmlformats.org/drawingml/2006/wordprocessingDrawing" xmlns:w10="urn:schemas-microsoft-com:office:word" xmlns:w="http://schemas.openxmlformats.org/wordprocessingml/2006/main" xmlns:w14="http://schemas.microsoft.com/office/word/2010/wordml" xmlns:w15="http://schemas.microsoft.com/office/word/2012/wordml" xmlns:w16se="http://schemas.microsoft.com/office/word/2015/wordml/symex" xmlns:wpg="http://schemas.microsoft.com/office/word/2010/wordprocessingGroup" xmlns:wpi="http://schemas.microsoft.com/office/word/2010/wordprocessingInk" xmlns:wne="http://schemas.microsoft.com/office/word/2006/wordml" xmlns:wps="http://schemas.microsoft.com/office/word/2010/wordprocessingShape" mc:Ignorable="w14 w15 w16se wp14">
   <w:body>
     <w:p>
       <w:pPr>
@@ -99,24 +99,31 @@
         </w:rPr>
         <w:t>This section presents a detailed explanation of the implementation of security measures, ethical considerations, and digital health practices within the Digital Team Hub project. Beyond simply describing the applied methods, this section aims to highlight their importance in ensuring a safe, responsible, and efficient collaborative environment for all team members.</w:t>
       </w:r>
+    </w:p>
+    <w:p>
+      <w:pPr>
+        <w:pStyle w:val="paragraph"/>
+        <w:textAlignment w:val="baseline"/>
+        <w:rPr>
+          <w:sz w:val="28"/>
+          <w:szCs w:val="28"/>
+        </w:rPr>
+      </w:pPr>
+      <w:r>
+        <w:rPr>
+          <w:sz w:val="28"/>
+          <w:szCs w:val="28"/>
+        </w:rPr>
+        <w:t>In the context of modern digital collaboration, teams often rely heavily on online platforms such as cloud storage systems, version control tools, and communication applications. While these technologies increase productivity and convenience, they also introduce potential risks related to data</w:t>
+      </w:r>
       <w:bookmarkStart w:id="0" w:name="_GoBack"/>
       <w:bookmarkEnd w:id="0"/>
-    </w:p>
-    <w:p>
-      <w:pPr>
-        <w:pStyle w:val="paragraph"/>
-        <w:textAlignment w:val="baseline"/>
-        <w:rPr>
-          <w:sz w:val="28"/>
-          <w:szCs w:val="28"/>
-        </w:rPr>
-      </w:pPr>
-      <w:r>
-        <w:rPr>
-          <w:sz w:val="28"/>
-          <w:szCs w:val="28"/>
-        </w:rPr>
-        <w:t>In the context of modern digital collaboration, teams often rely heavily on online platforms such as cloud storage systems, version control tools, and communication applications. While these technologies increase productivity and convenience, they also introduce potential risks related to data breaches, unauthorized access, and misuse of information. Therefore, implementing robust security measures is essential to protect both individual and team data.</w:t>
+      <w:r>
+        <w:rPr>
+          <w:sz w:val="28"/>
+          <w:szCs w:val="28"/>
+        </w:rPr>
+        <w:t xml:space="preserve"> breaches, unauthorized access, and misuse of information. Therefore, implementing robust security measures is essential to protect both individual and team data.</w:t>
       </w:r>
     </w:p>
     <w:p>
@@ -827,14 +834,7 @@
           <w:sz w:val="28"/>
           <w:szCs w:val="28"/>
         </w:rPr>
-        <w:t xml:space="preserve">Objective: </w:t>
-      </w:r>
-      <w:r>
-        <w:rPr>
-          <w:sz w:val="28"/>
-          <w:szCs w:val="28"/>
-        </w:rPr>
-        <w:t>The purpose of establishing a password policy is to create a standardized approach to password creation and management, thereby minimizing vulnerabilities caused by weak or reused passwords.</w:t>
+        <w:t>Objective: The purpose of establishing a password policy is to create a standardized approach to password creation and management, thereby minimizing vulnerabilities caused by weak or reused passwords.</w:t>
       </w:r>
     </w:p>
     <w:p>
@@ -874,14 +874,7 @@
           <w:sz w:val="28"/>
           <w:szCs w:val="28"/>
         </w:rPr>
-        <w:t>Password length must be between 8–12 characters (or longer when possible for increased security)</w:t>
-      </w:r>
-      <w:r>
-        <w:rPr>
-          <w:sz w:val="28"/>
-          <w:szCs w:val="28"/>
-        </w:rPr>
-        <w:t>.</w:t>
+        <w:t>Password length must be between 8–12 characters (or longer when possible for increased security).</w:t>
       </w:r>
     </w:p>
     <w:p>
@@ -902,70 +895,7 @@
           <w:sz w:val="28"/>
           <w:szCs w:val="28"/>
         </w:rPr>
-        <w:t>Passwords must include:</w:t>
-      </w:r>
-      <w:r>
-        <w:rPr>
-          <w:sz w:val="28"/>
-          <w:szCs w:val="28"/>
-        </w:rPr>
-        <w:t xml:space="preserve"> </w:t>
-      </w:r>
-      <w:r>
-        <w:rPr>
-          <w:sz w:val="28"/>
-          <w:szCs w:val="28"/>
-        </w:rPr>
-        <w:t>Uppercase letters</w:t>
-      </w:r>
-      <w:r>
-        <w:rPr>
-          <w:sz w:val="28"/>
-          <w:szCs w:val="28"/>
-        </w:rPr>
-        <w:t>, l</w:t>
-      </w:r>
-      <w:r>
-        <w:rPr>
-          <w:sz w:val="28"/>
-          <w:szCs w:val="28"/>
-        </w:rPr>
-        <w:t>owercase letters</w:t>
-      </w:r>
-      <w:r>
-        <w:rPr>
-          <w:sz w:val="28"/>
-          <w:szCs w:val="28"/>
-        </w:rPr>
-        <w:t>, n</w:t>
-      </w:r>
-      <w:r>
-        <w:rPr>
-          <w:sz w:val="28"/>
-          <w:szCs w:val="28"/>
-        </w:rPr>
-        <w:t>umbers</w:t>
-      </w:r>
-      <w:r>
-        <w:rPr>
-          <w:sz w:val="28"/>
-          <w:szCs w:val="28"/>
-        </w:rPr>
-        <w:t>, s</w:t>
-      </w:r>
-      <w:r>
-        <w:rPr>
-          <w:sz w:val="28"/>
-          <w:szCs w:val="28"/>
-        </w:rPr>
-        <w:t>pecial characters (e.g., @, #, $, %)</w:t>
-      </w:r>
-      <w:r>
-        <w:rPr>
-          <w:sz w:val="28"/>
-          <w:szCs w:val="28"/>
-        </w:rPr>
-        <w:t>.</w:t>
+        <w:t>Passwords must include: Uppercase letters, lowercase letters, numbers, special characters (e.g., @, #, $, %).</w:t>
       </w:r>
     </w:p>
     <w:p>
@@ -986,14 +916,7 @@
           <w:sz w:val="28"/>
           <w:szCs w:val="28"/>
         </w:rPr>
-        <w:t>Password reuse is strictly prohibited</w:t>
-      </w:r>
-      <w:r>
-        <w:rPr>
-          <w:sz w:val="28"/>
-          <w:szCs w:val="28"/>
-        </w:rPr>
-        <w:t>.</w:t>
+        <w:t>Password reuse is strictly prohibited.</w:t>
       </w:r>
     </w:p>
     <w:p>
@@ -1014,14 +937,7 @@
           <w:sz w:val="28"/>
           <w:szCs w:val="28"/>
         </w:rPr>
-        <w:t>Passwords must be updated every 60–90 days</w:t>
-      </w:r>
-      <w:r>
-        <w:rPr>
-          <w:sz w:val="28"/>
-          <w:szCs w:val="28"/>
-        </w:rPr>
-        <w:t>.</w:t>
+        <w:t>Passwords must be updated every 60–90 days.</w:t>
       </w:r>
     </w:p>
     <w:p>
@@ -1042,14 +958,7 @@
           <w:sz w:val="28"/>
           <w:szCs w:val="28"/>
         </w:rPr>
-        <w:t>Avoid using personal information such as names or birthdays</w:t>
-      </w:r>
-      <w:r>
-        <w:rPr>
-          <w:sz w:val="28"/>
-          <w:szCs w:val="28"/>
-        </w:rPr>
-        <w:t>.</w:t>
+        <w:t>Avoid using personal information such as names or birthdays.</w:t>
       </w:r>
     </w:p>
     <w:p>
@@ -1070,14 +979,7 @@
           <w:sz w:val="28"/>
           <w:szCs w:val="28"/>
         </w:rPr>
-        <w:t>Use passphrases instead of simple passwords for better memorability and strength</w:t>
-      </w:r>
-      <w:r>
-        <w:rPr>
-          <w:sz w:val="28"/>
-          <w:szCs w:val="28"/>
-        </w:rPr>
-        <w:t>.</w:t>
+        <w:t>Use passphrases instead of simple passwords for better memorability and strength.</w:t>
       </w:r>
     </w:p>
     <w:p>
@@ -1098,14 +1000,39 @@
           <w:sz w:val="28"/>
           <w:szCs w:val="28"/>
         </w:rPr>
-        <w:t>Utilize password managers (e.g., LastPass, Bitwarden) to securely store credentials</w:t>
-      </w:r>
-      <w:r>
-        <w:rPr>
-          <w:sz w:val="28"/>
-          <w:szCs w:val="28"/>
-        </w:rPr>
-        <w:t>.</w:t>
+        <w:t xml:space="preserve">Utilize password managers (e.g., </w:t>
+      </w:r>
+      <w:proofErr w:type="spellStart"/>
+      <w:r>
+        <w:rPr>
+          <w:sz w:val="28"/>
+          <w:szCs w:val="28"/>
+        </w:rPr>
+        <w:t>LastPass</w:t>
+      </w:r>
+      <w:proofErr w:type="spellEnd"/>
+      <w:r>
+        <w:rPr>
+          <w:sz w:val="28"/>
+          <w:szCs w:val="28"/>
+        </w:rPr>
+        <w:t xml:space="preserve">, </w:t>
+      </w:r>
+      <w:proofErr w:type="spellStart"/>
+      <w:r>
+        <w:rPr>
+          <w:sz w:val="28"/>
+          <w:szCs w:val="28"/>
+        </w:rPr>
+        <w:t>Bitwarden</w:t>
+      </w:r>
+      <w:proofErr w:type="spellEnd"/>
+      <w:r>
+        <w:rPr>
+          <w:sz w:val="28"/>
+          <w:szCs w:val="28"/>
+        </w:rPr>
+        <w:t>) to securely store credentials.</w:t>
       </w:r>
     </w:p>
     <w:p>
@@ -1126,14 +1053,7 @@
           <w:sz w:val="28"/>
           <w:szCs w:val="28"/>
         </w:rPr>
-        <w:t>Enable alerts for suspicious login activity</w:t>
-      </w:r>
-      <w:r>
-        <w:rPr>
-          <w:sz w:val="28"/>
-          <w:szCs w:val="28"/>
-        </w:rPr>
-        <w:t>.</w:t>
+        <w:t>Enable alerts for suspicious login activity.</w:t>
       </w:r>
     </w:p>
     <w:p>
@@ -1536,7 +1456,6 @@
         <w:spacing w:before="0" w:beforeAutospacing="0" w:after="0" w:afterAutospacing="0"/>
         <w:textAlignment w:val="baseline"/>
         <w:rPr>
-          <w:rStyle w:val="eop"/>
           <w:sz w:val="28"/>
           <w:szCs w:val="28"/>
         </w:rPr>
@@ -1591,11 +1510,56 @@
       </w:pPr>
       <w:r>
         <w:rPr>
+          <w:rStyle w:val="eop"/>
+          <w:sz w:val="28"/>
+          <w:szCs w:val="28"/>
+        </w:rPr>
+        <w:t> </w:t>
+      </w:r>
+    </w:p>
+    <w:p>
+      <w:pPr>
+        <w:pStyle w:val="paragraph"/>
+        <w:spacing w:before="0" w:beforeAutospacing="0" w:after="0" w:afterAutospacing="0"/>
+        <w:textAlignment w:val="baseline"/>
+        <w:rPr>
+          <w:rStyle w:val="normaltextrun"/>
+          <w:b/>
+          <w:bCs/>
+          <w:sz w:val="28"/>
+          <w:szCs w:val="28"/>
+          <w:lang w:val="vi-VN"/>
+        </w:rPr>
+      </w:pPr>
+      <w:r>
+        <w:rPr>
+          <w:rStyle w:val="normaltextrun"/>
+          <w:b/>
+          <w:bCs/>
+          <w:sz w:val="28"/>
+          <w:szCs w:val="28"/>
+          <w:lang w:val="vi-VN"/>
+        </w:rPr>
+        <w:t>Member 1: Tuong Vy</w:t>
+      </w:r>
+    </w:p>
+    <w:p>
+      <w:pPr>
+        <w:pStyle w:val="paragraph"/>
+        <w:spacing w:before="0" w:beforeAutospacing="0" w:after="0" w:afterAutospacing="0"/>
+        <w:textAlignment w:val="baseline"/>
+        <w:rPr>
+          <w:sz w:val="18"/>
+          <w:szCs w:val="18"/>
+        </w:rPr>
+      </w:pPr>
+      <w:r>
+        <w:rPr>
           <w:noProof/>
         </w:rPr>
         <w:lastRenderedPageBreak/>
         <w:drawing>
-          <wp:inline distT="0" distB="0" distL="0" distR="0" wp14:anchorId="154F1B10" wp14:editId="2C3D4C48">
+          <wp:inline distT="0" distB="0" distL="0" distR="0" wp14:anchorId="264E17FD" wp14:editId="1CFAFFF5">
             <wp:extent cx="4467225" cy="5581650"/>
             <wp:effectExtent l="0" t="0" r="9525" b="0"/>
             <wp:docPr id="5" name="Picture 5"/>
@@ -1630,6 +1594,14 @@
           </wp:inline>
         </w:drawing>
       </w:r>
+      <w:r>
+        <w:rPr>
+          <w:rStyle w:val="eop"/>
+          <w:sz w:val="28"/>
+          <w:szCs w:val="28"/>
+        </w:rPr>
+        <w:t> </w:t>
+      </w:r>
     </w:p>
     <w:p>
       <w:pPr>
@@ -1643,6 +1615,26 @@
       </w:pPr>
       <w:r>
         <w:rPr>
+          <w:rStyle w:val="normaltextrun"/>
+          <w:b/>
+          <w:bCs/>
+          <w:sz w:val="28"/>
+          <w:szCs w:val="28"/>
+          <w:lang w:val="vi-VN"/>
+        </w:rPr>
+        <w:t>Observation</w:t>
+      </w:r>
+      <w:r>
+        <w:rPr>
+          <w:rStyle w:val="normaltextrun"/>
+          <w:sz w:val="28"/>
+          <w:szCs w:val="28"/>
+          <w:lang w:val="vi-VN"/>
+        </w:rPr>
+        <w:t>: The member is using a desktop monitor placed slightly below eye level. The sitting posture shows a slight forward lean while writing notes.</w:t>
+      </w:r>
+      <w:r>
+        <w:rPr>
           <w:rStyle w:val="eop"/>
           <w:sz w:val="28"/>
           <w:szCs w:val="28"/>
@@ -1669,7 +1661,16 @@
           <w:szCs w:val="28"/>
           <w:lang w:val="vi-VN"/>
         </w:rPr>
-        <w:t>Member 1: Tuong Vy</w:t>
+        <w:t> Issues Identified</w:t>
+      </w:r>
+      <w:r>
+        <w:rPr>
+          <w:rStyle w:val="normaltextrun"/>
+          <w:sz w:val="28"/>
+          <w:szCs w:val="28"/>
+          <w:lang w:val="vi-VN"/>
+        </w:rPr>
+        <w:t>: Neck bending downward may cause strain; writing posture not fully supported.</w:t>
       </w:r>
       <w:r>
         <w:rPr>
@@ -1699,16 +1700,16 @@
           <w:szCs w:val="28"/>
           <w:lang w:val="vi-VN"/>
         </w:rPr>
-        <w:t>Observation</w:t>
-      </w:r>
-      <w:r>
-        <w:rPr>
-          <w:rStyle w:val="normaltextrun"/>
-          <w:sz w:val="28"/>
-          <w:szCs w:val="28"/>
-          <w:lang w:val="vi-VN"/>
-        </w:rPr>
-        <w:t>: The member is using a desktop monitor placed slightly below eye level. The sitting posture shows a slight forward lean while writing notes.</w:t>
+        <w:t> Improvements Suggested</w:t>
+      </w:r>
+      <w:r>
+        <w:rPr>
+          <w:rStyle w:val="normaltextrun"/>
+          <w:sz w:val="28"/>
+          <w:szCs w:val="28"/>
+          <w:lang w:val="vi-VN"/>
+        </w:rPr>
+        <w:t>: Raise monitor height to eye level and maintain a straight back posture while working.</w:t>
       </w:r>
       <w:r>
         <w:rPr>
@@ -1731,6 +1732,26 @@
       </w:pPr>
       <w:r>
         <w:rPr>
+          <w:rStyle w:val="eop"/>
+          <w:sz w:val="28"/>
+          <w:szCs w:val="28"/>
+        </w:rPr>
+        <w:t> </w:t>
+      </w:r>
+    </w:p>
+    <w:p>
+      <w:pPr>
+        <w:pStyle w:val="paragraph"/>
+        <w:spacing w:before="0" w:beforeAutospacing="0" w:after="0" w:afterAutospacing="0"/>
+        <w:textAlignment w:val="baseline"/>
+        <w:rPr>
+          <w:rStyle w:val="eop"/>
+          <w:sz w:val="28"/>
+          <w:szCs w:val="28"/>
+        </w:rPr>
+      </w:pPr>
+      <w:r>
+        <w:rPr>
           <w:rStyle w:val="normaltextrun"/>
           <w:b/>
           <w:bCs/>
@@ -1738,16 +1759,7 @@
           <w:szCs w:val="28"/>
           <w:lang w:val="vi-VN"/>
         </w:rPr>
-        <w:t> Issues Identified</w:t>
-      </w:r>
-      <w:r>
-        <w:rPr>
-          <w:rStyle w:val="normaltextrun"/>
-          <w:sz w:val="28"/>
-          <w:szCs w:val="28"/>
-          <w:lang w:val="vi-VN"/>
-        </w:rPr>
-        <w:t>: Neck bending downward may cause strain; writing posture not fully supported.</w:t>
+        <w:t>Member 2: Ngoc Huyen</w:t>
       </w:r>
       <w:r>
         <w:rPr>
@@ -1770,58 +1782,11 @@
       </w:pPr>
       <w:r>
         <w:rPr>
-          <w:rStyle w:val="normaltextrun"/>
-          <w:b/>
-          <w:bCs/>
-          <w:sz w:val="28"/>
-          <w:szCs w:val="28"/>
-          <w:lang w:val="vi-VN"/>
-        </w:rPr>
-        <w:t> Improvements Suggested</w:t>
-      </w:r>
-      <w:r>
-        <w:rPr>
-          <w:rStyle w:val="normaltextrun"/>
-          <w:sz w:val="28"/>
-          <w:szCs w:val="28"/>
-          <w:lang w:val="vi-VN"/>
-        </w:rPr>
-        <w:t>: Raise monitor height to eye level and maintain a straight back posture while working.</w:t>
-      </w:r>
-      <w:r>
-        <w:rPr>
-          <w:rStyle w:val="eop"/>
-          <w:sz w:val="28"/>
-          <w:szCs w:val="28"/>
-        </w:rPr>
-        <w:t> </w:t>
-      </w:r>
-    </w:p>
-    <w:p>
-      <w:pPr>
-        <w:pStyle w:val="paragraph"/>
-        <w:spacing w:before="0" w:beforeAutospacing="0" w:after="0" w:afterAutospacing="0"/>
-        <w:textAlignment w:val="baseline"/>
-        <w:rPr>
-          <w:sz w:val="18"/>
-          <w:szCs w:val="18"/>
-        </w:rPr>
-      </w:pPr>
-      <w:r>
-        <w:rPr>
-          <w:rStyle w:val="eop"/>
-          <w:sz w:val="28"/>
-          <w:szCs w:val="28"/>
+          <w:noProof/>
         </w:rPr>
         <w:lastRenderedPageBreak/>
-        <w:t> </w:t>
-      </w:r>
-      <w:r>
-        <w:rPr>
-          <w:noProof/>
-        </w:rPr>
         <w:drawing>
-          <wp:inline distT="0" distB="0" distL="0" distR="0" wp14:anchorId="0FF931E3" wp14:editId="3314461B">
+          <wp:inline distT="0" distB="0" distL="0" distR="0" wp14:anchorId="68C48983" wp14:editId="56DC53C2">
             <wp:extent cx="4581525" cy="5133975"/>
             <wp:effectExtent l="0" t="0" r="9525" b="9525"/>
             <wp:docPr id="6" name="Picture 6"/>
@@ -1876,7 +1841,16 @@
           <w:szCs w:val="28"/>
           <w:lang w:val="vi-VN"/>
         </w:rPr>
-        <w:t>Member 2: Ngoc Huyen</w:t>
+        <w:t>Observation</w:t>
+      </w:r>
+      <w:r>
+        <w:rPr>
+          <w:rStyle w:val="normaltextrun"/>
+          <w:sz w:val="28"/>
+          <w:szCs w:val="28"/>
+          <w:lang w:val="vi-VN"/>
+        </w:rPr>
+        <w:t>: The member is working on a laptop in a café-like environment with moderate lighting. Posture is relatively upright but slightly hunched forward.</w:t>
       </w:r>
       <w:r>
         <w:rPr>
@@ -1906,16 +1880,16 @@
           <w:szCs w:val="28"/>
           <w:lang w:val="vi-VN"/>
         </w:rPr>
-        <w:t>Observation</w:t>
-      </w:r>
-      <w:r>
-        <w:rPr>
-          <w:rStyle w:val="normaltextrun"/>
-          <w:sz w:val="28"/>
-          <w:szCs w:val="28"/>
-          <w:lang w:val="vi-VN"/>
-        </w:rPr>
-        <w:t>: The member is working on a laptop in a café-like environment with moderate lighting. Posture is relatively upright but slightly hunched forward.</w:t>
+        <w:t>Issues Identified: </w:t>
+      </w:r>
+      <w:r>
+        <w:rPr>
+          <w:rStyle w:val="normaltextrun"/>
+          <w:sz w:val="28"/>
+          <w:szCs w:val="28"/>
+          <w:lang w:val="vi-VN"/>
+        </w:rPr>
+        <w:t>Laptop screen too low leading to neck strain; prolonged sitting without back support.</w:t>
       </w:r>
       <w:r>
         <w:rPr>
@@ -1945,16 +1919,16 @@
           <w:szCs w:val="28"/>
           <w:lang w:val="vi-VN"/>
         </w:rPr>
-        <w:t>Issues Identified: </w:t>
-      </w:r>
-      <w:r>
-        <w:rPr>
-          <w:rStyle w:val="normaltextrun"/>
-          <w:sz w:val="28"/>
-          <w:szCs w:val="28"/>
-          <w:lang w:val="vi-VN"/>
-        </w:rPr>
-        <w:t>Laptop screen too low leading to neck strain; prolonged sitting without back support.</w:t>
+        <w:t>Improvements Suggested:</w:t>
+      </w:r>
+      <w:r>
+        <w:rPr>
+          <w:rStyle w:val="normaltextrun"/>
+          <w:sz w:val="28"/>
+          <w:szCs w:val="28"/>
+          <w:lang w:val="vi-VN"/>
+        </w:rPr>
+        <w:t> Use a laptop stand and external keyboard; ensure back support while sitting.</w:t>
       </w:r>
       <w:r>
         <w:rPr>
@@ -1977,26 +1951,6 @@
       </w:pPr>
       <w:r>
         <w:rPr>
-          <w:rStyle w:val="normaltextrun"/>
-          <w:b/>
-          <w:bCs/>
-          <w:sz w:val="28"/>
-          <w:szCs w:val="28"/>
-          <w:lang w:val="vi-VN"/>
-        </w:rPr>
-        <w:t>Improvements Suggested:</w:t>
-      </w:r>
-      <w:r>
-        <w:rPr>
-          <w:rStyle w:val="normaltextrun"/>
-          <w:sz w:val="28"/>
-          <w:szCs w:val="28"/>
-          <w:lang w:val="vi-VN"/>
-        </w:rPr>
-        <w:t> Use a laptop stand and external keyboard; ensure back support while sitting.</w:t>
-      </w:r>
-      <w:r>
-        <w:rPr>
           <w:rStyle w:val="eop"/>
           <w:sz w:val="28"/>
           <w:szCs w:val="28"/>
@@ -2014,6 +1968,29 @@
           <w:szCs w:val="18"/>
         </w:rPr>
       </w:pPr>
+    </w:p>
+    <w:p>
+      <w:pPr>
+        <w:pStyle w:val="paragraph"/>
+        <w:spacing w:before="0" w:beforeAutospacing="0" w:after="0" w:afterAutospacing="0"/>
+        <w:textAlignment w:val="baseline"/>
+        <w:rPr>
+          <w:rStyle w:val="eop"/>
+          <w:sz w:val="28"/>
+          <w:szCs w:val="28"/>
+        </w:rPr>
+      </w:pPr>
+      <w:r>
+        <w:rPr>
+          <w:rStyle w:val="normaltextrun"/>
+          <w:b/>
+          <w:bCs/>
+          <w:sz w:val="28"/>
+          <w:szCs w:val="28"/>
+          <w:lang w:val="vi-VN"/>
+        </w:rPr>
+        <w:t>Member 3: Nhu Y</w:t>
+      </w:r>
       <w:r>
         <w:rPr>
           <w:rStyle w:val="eop"/>
@@ -2035,19 +2012,11 @@
       </w:pPr>
       <w:r>
         <w:rPr>
-          <w:rStyle w:val="eop"/>
-          <w:sz w:val="28"/>
-          <w:szCs w:val="28"/>
+          <w:noProof/>
         </w:rPr>
         <w:lastRenderedPageBreak/>
-        <w:t> </w:t>
-      </w:r>
-      <w:r>
-        <w:rPr>
-          <w:noProof/>
-        </w:rPr>
         <w:drawing>
-          <wp:inline distT="0" distB="0" distL="0" distR="0" wp14:anchorId="6D7841A3" wp14:editId="44E951A8">
+          <wp:inline distT="0" distB="0" distL="0" distR="0" wp14:anchorId="734E0EBC" wp14:editId="149833F7">
             <wp:extent cx="3048000" cy="3876675"/>
             <wp:effectExtent l="0" t="0" r="0" b="9525"/>
             <wp:docPr id="7" name="Picture 7"/>
@@ -2102,7 +2071,16 @@
           <w:szCs w:val="28"/>
           <w:lang w:val="vi-VN"/>
         </w:rPr>
-        <w:t>Member 3: Nhu Y</w:t>
+        <w:t>Observation</w:t>
+      </w:r>
+      <w:r>
+        <w:rPr>
+          <w:rStyle w:val="normaltextrun"/>
+          <w:sz w:val="28"/>
+          <w:szCs w:val="28"/>
+          <w:lang w:val="vi-VN"/>
+        </w:rPr>
+        <w:t>: The member is seated in a computer lab using a laptop placed on a desk. Posture is slightly leaned forward with arms resting on the desk.</w:t>
       </w:r>
       <w:r>
         <w:rPr>
@@ -2132,16 +2110,16 @@
           <w:szCs w:val="28"/>
           <w:lang w:val="vi-VN"/>
         </w:rPr>
-        <w:t>Observation</w:t>
-      </w:r>
-      <w:r>
-        <w:rPr>
-          <w:rStyle w:val="normaltextrun"/>
-          <w:sz w:val="28"/>
-          <w:szCs w:val="28"/>
-          <w:lang w:val="vi-VN"/>
-        </w:rPr>
-        <w:t>: The member is seated in a computer lab using a laptop placed on a desk. Posture is slightly leaned forward with arms resting on the desk.</w:t>
+        <w:t>Issues Identified</w:t>
+      </w:r>
+      <w:r>
+        <w:rPr>
+          <w:rStyle w:val="normaltextrun"/>
+          <w:sz w:val="28"/>
+          <w:szCs w:val="28"/>
+          <w:lang w:val="vi-VN"/>
+        </w:rPr>
+        <w:t>: Screen height is low; chair does not fully support ergonomic posture.</w:t>
       </w:r>
       <w:r>
         <w:rPr>
@@ -2171,16 +2149,16 @@
           <w:szCs w:val="28"/>
           <w:lang w:val="vi-VN"/>
         </w:rPr>
-        <w:t>Issues Identified</w:t>
-      </w:r>
-      <w:r>
-        <w:rPr>
-          <w:rStyle w:val="normaltextrun"/>
-          <w:sz w:val="28"/>
-          <w:szCs w:val="28"/>
-          <w:lang w:val="vi-VN"/>
-        </w:rPr>
-        <w:t>: Screen height is low; chair does not fully support ergonomic posture.</w:t>
+        <w:t>Improvements Suggested</w:t>
+      </w:r>
+      <w:r>
+        <w:rPr>
+          <w:rStyle w:val="normaltextrun"/>
+          <w:sz w:val="28"/>
+          <w:szCs w:val="28"/>
+          <w:lang w:val="vi-VN"/>
+        </w:rPr>
+        <w:t>: Adjust chair height and keep screen closer to eye level; maintain neutral wrist position.</w:t>
       </w:r>
       <w:r>
         <w:rPr>
@@ -2203,6 +2181,26 @@
       </w:pPr>
       <w:r>
         <w:rPr>
+          <w:rStyle w:val="eop"/>
+          <w:sz w:val="28"/>
+          <w:szCs w:val="28"/>
+        </w:rPr>
+        <w:t> </w:t>
+      </w:r>
+    </w:p>
+    <w:p>
+      <w:pPr>
+        <w:pStyle w:val="paragraph"/>
+        <w:spacing w:before="0" w:beforeAutospacing="0" w:after="0" w:afterAutospacing="0"/>
+        <w:textAlignment w:val="baseline"/>
+        <w:rPr>
+          <w:rStyle w:val="eop"/>
+          <w:sz w:val="28"/>
+          <w:szCs w:val="28"/>
+        </w:rPr>
+      </w:pPr>
+      <w:r>
+        <w:rPr>
           <w:rStyle w:val="normaltextrun"/>
           <w:b/>
           <w:bCs/>
@@ -2210,16 +2208,7 @@
           <w:szCs w:val="28"/>
           <w:lang w:val="vi-VN"/>
         </w:rPr>
-        <w:t>Improvements Suggested</w:t>
-      </w:r>
-      <w:r>
-        <w:rPr>
-          <w:rStyle w:val="normaltextrun"/>
-          <w:sz w:val="28"/>
-          <w:szCs w:val="28"/>
-          <w:lang w:val="vi-VN"/>
-        </w:rPr>
-        <w:t>: Adjust chair height and keep screen closer to eye level; maintain neutral wrist position.</w:t>
+        <w:t>Member 4: Minh Thao</w:t>
       </w:r>
       <w:r>
         <w:rPr>
@@ -2242,19 +2231,11 @@
       </w:pPr>
       <w:r>
         <w:rPr>
-          <w:rStyle w:val="eop"/>
-          <w:sz w:val="28"/>
-          <w:szCs w:val="28"/>
+          <w:noProof/>
         </w:rPr>
         <w:lastRenderedPageBreak/>
-        <w:t> </w:t>
-      </w:r>
-      <w:r>
-        <w:rPr>
-          <w:noProof/>
-        </w:rPr>
         <w:drawing>
-          <wp:inline distT="0" distB="0" distL="0" distR="0" wp14:anchorId="368AA37E" wp14:editId="726DE76F">
+          <wp:inline distT="0" distB="0" distL="0" distR="0" wp14:anchorId="6F0C2AA7" wp14:editId="40CD33E4">
             <wp:extent cx="5543550" cy="5143500"/>
             <wp:effectExtent l="0" t="0" r="0" b="0"/>
             <wp:docPr id="8" name="Picture 8"/>
@@ -2309,7 +2290,16 @@
           <w:szCs w:val="28"/>
           <w:lang w:val="vi-VN"/>
         </w:rPr>
-        <w:t>Member 4: Minh Thao</w:t>
+        <w:t>Observation:</w:t>
+      </w:r>
+      <w:r>
+        <w:rPr>
+          <w:rStyle w:val="normaltextrun"/>
+          <w:sz w:val="28"/>
+          <w:szCs w:val="28"/>
+          <w:lang w:val="vi-VN"/>
+        </w:rPr>
+        <w:t> The member is working at a home desk setup with a laptop. The desk is organized with books and personal items; posture is slightly bent forward.</w:t>
       </w:r>
       <w:r>
         <w:rPr>
@@ -2339,16 +2329,16 @@
           <w:szCs w:val="28"/>
           <w:lang w:val="vi-VN"/>
         </w:rPr>
-        <w:t>Observation:</w:t>
-      </w:r>
-      <w:r>
-        <w:rPr>
-          <w:rStyle w:val="normaltextrun"/>
-          <w:sz w:val="28"/>
-          <w:szCs w:val="28"/>
-          <w:lang w:val="vi-VN"/>
-        </w:rPr>
-        <w:t> The member is working at a home desk setup with a laptop. The desk is organized with books and personal items; posture is slightly bent forward.</w:t>
+        <w:t>Issues Identified</w:t>
+      </w:r>
+      <w:r>
+        <w:rPr>
+          <w:rStyle w:val="normaltextrun"/>
+          <w:sz w:val="28"/>
+          <w:szCs w:val="28"/>
+          <w:lang w:val="vi-VN"/>
+        </w:rPr>
+        <w:t>: Screen too low; potential eye strain due to close distance; clutter may reduce workspace efficiency.</w:t>
       </w:r>
       <w:r>
         <w:rPr>
@@ -2378,16 +2368,16 @@
           <w:szCs w:val="28"/>
           <w:lang w:val="vi-VN"/>
         </w:rPr>
-        <w:t>Issues Identified</w:t>
-      </w:r>
-      <w:r>
-        <w:rPr>
-          <w:rStyle w:val="normaltextrun"/>
-          <w:sz w:val="28"/>
-          <w:szCs w:val="28"/>
-          <w:lang w:val="vi-VN"/>
-        </w:rPr>
-        <w:t>: Screen too low; potential eye strain due to close distance; clutter may reduce workspace efficiency.</w:t>
+        <w:t>Improvements Suggested</w:t>
+      </w:r>
+      <w:r>
+        <w:rPr>
+          <w:rStyle w:val="normaltextrun"/>
+          <w:sz w:val="28"/>
+          <w:szCs w:val="28"/>
+          <w:lang w:val="vi-VN"/>
+        </w:rPr>
+        <w:t>: Raise laptop using a stand, maintain proper viewing distance (50–70 cm), and keep workspace more organized.</w:t>
       </w:r>
       <w:r>
         <w:rPr>
@@ -2410,6 +2400,26 @@
       </w:pPr>
       <w:r>
         <w:rPr>
+          <w:rStyle w:val="eop"/>
+          <w:sz w:val="28"/>
+          <w:szCs w:val="28"/>
+        </w:rPr>
+        <w:t> </w:t>
+      </w:r>
+    </w:p>
+    <w:p>
+      <w:pPr>
+        <w:pStyle w:val="paragraph"/>
+        <w:spacing w:before="0" w:beforeAutospacing="0" w:after="0" w:afterAutospacing="0"/>
+        <w:textAlignment w:val="baseline"/>
+        <w:rPr>
+          <w:rStyle w:val="eop"/>
+          <w:sz w:val="28"/>
+          <w:szCs w:val="28"/>
+        </w:rPr>
+      </w:pPr>
+      <w:r>
+        <w:rPr>
           <w:rStyle w:val="normaltextrun"/>
           <w:b/>
           <w:bCs/>
@@ -2417,16 +2427,7 @@
           <w:szCs w:val="28"/>
           <w:lang w:val="vi-VN"/>
         </w:rPr>
-        <w:t>Improvements Suggested</w:t>
-      </w:r>
-      <w:r>
-        <w:rPr>
-          <w:rStyle w:val="normaltextrun"/>
-          <w:sz w:val="28"/>
-          <w:szCs w:val="28"/>
-          <w:lang w:val="vi-VN"/>
-        </w:rPr>
-        <w:t>: Raise laptop using a stand, maintain proper viewing distance (50–70 cm), and keep workspace more organized.</w:t>
+        <w:t>Member 5: Bich Phuong</w:t>
       </w:r>
       <w:r>
         <w:rPr>
@@ -2449,19 +2450,11 @@
       </w:pPr>
       <w:r>
         <w:rPr>
-          <w:rStyle w:val="eop"/>
-          <w:sz w:val="28"/>
-          <w:szCs w:val="28"/>
+          <w:noProof/>
         </w:rPr>
         <w:lastRenderedPageBreak/>
-        <w:t> </w:t>
-      </w:r>
-      <w:r>
-        <w:rPr>
-          <w:noProof/>
-        </w:rPr>
         <w:drawing>
-          <wp:inline distT="0" distB="0" distL="0" distR="0" wp14:anchorId="73A38D16" wp14:editId="717F5D08">
+          <wp:inline distT="0" distB="0" distL="0" distR="0" wp14:anchorId="0CB39663" wp14:editId="609D1633">
             <wp:extent cx="3514725" cy="4219575"/>
             <wp:effectExtent l="0" t="0" r="9525" b="9525"/>
             <wp:docPr id="9" name="Picture 9"/>
@@ -2516,36 +2509,6 @@
           <w:szCs w:val="28"/>
           <w:lang w:val="vi-VN"/>
         </w:rPr>
-        <w:t>Member 5: Bich Phuong</w:t>
-      </w:r>
-      <w:r>
-        <w:rPr>
-          <w:rStyle w:val="eop"/>
-          <w:sz w:val="28"/>
-          <w:szCs w:val="28"/>
-        </w:rPr>
-        <w:t> </w:t>
-      </w:r>
-    </w:p>
-    <w:p>
-      <w:pPr>
-        <w:pStyle w:val="paragraph"/>
-        <w:spacing w:before="0" w:beforeAutospacing="0" w:after="0" w:afterAutospacing="0"/>
-        <w:textAlignment w:val="baseline"/>
-        <w:rPr>
-          <w:sz w:val="18"/>
-          <w:szCs w:val="18"/>
-        </w:rPr>
-      </w:pPr>
-      <w:r>
-        <w:rPr>
-          <w:rStyle w:val="normaltextrun"/>
-          <w:b/>
-          <w:bCs/>
-          <w:sz w:val="28"/>
-          <w:szCs w:val="28"/>
-          <w:lang w:val="vi-VN"/>
-        </w:rPr>
         <w:t>Observation:</w:t>
       </w:r>
       <w:r>
@@ -2926,7 +2889,6 @@
           <w:sz w:val="28"/>
           <w:szCs w:val="28"/>
         </w:rPr>
-        <w:lastRenderedPageBreak/>
         <w:t xml:space="preserve">Proper acknowledgment was maintained to avoid plagiarism </w:t>
       </w:r>
     </w:p>
@@ -2946,6 +2908,7 @@
           <w:sz w:val="28"/>
           <w:szCs w:val="28"/>
         </w:rPr>
+        <w:lastRenderedPageBreak/>
         <w:t xml:space="preserve">- </w:t>
       </w:r>
       <w:r>
@@ -3182,8 +3145,8 @@
 </file>
 
 <file path=word/numbering.xml><?xml version="1.0" encoding="utf-8"?>
-<w:numbering xmlns:wpc="http://schemas.microsoft.com/office/word/2010/wordprocessingCanvas" xmlns:mc="http://schemas.openxmlformats.org/markup-compatibility/2006" xmlns:o="urn:schemas-microsoft-com:office:office" xmlns:r="http://schemas.openxmlformats.org/officeDocument/2006/relationships" xmlns:m="http://schemas.openxmlformats.org/officeDocument/2006/math" xmlns:v="urn:schemas-microsoft-com:vml" xmlns:wp14="http://schemas.microsoft.com/office/word/2010/wordprocessingDrawing" xmlns:wp="http://schemas.openxmlformats.org/drawingml/2006/wordprocessingDrawing" xmlns:w10="urn:schemas-microsoft-com:office:word" xmlns:w="http://schemas.openxmlformats.org/wordprocessingml/2006/main" xmlns:w14="http://schemas.microsoft.com/office/word/2010/wordml" xmlns:w15="http://schemas.microsoft.com/office/word/2012/wordml" xmlns:wpg="http://schemas.microsoft.com/office/word/2010/wordprocessingGroup" xmlns:wpi="http://schemas.microsoft.com/office/word/2010/wordprocessingInk" xmlns:wne="http://schemas.microsoft.com/office/word/2006/wordml" xmlns:wps="http://schemas.microsoft.com/office/word/2010/wordprocessingShape" mc:Ignorable="w14 w15 wp14">
-  <w:abstractNum w:abstractNumId="0">
+<w:numbering xmlns:wpc="http://schemas.microsoft.com/office/word/2010/wordprocessingCanvas" xmlns:cx="http://schemas.microsoft.com/office/drawing/2014/chartex" xmlns:mc="http://schemas.openxmlformats.org/markup-compatibility/2006" xmlns:o="urn:schemas-microsoft-com:office:office" xmlns:r="http://schemas.openxmlformats.org/officeDocument/2006/relationships" xmlns:m="http://schemas.openxmlformats.org/officeDocument/2006/math" xmlns:v="urn:schemas-microsoft-com:vml" xmlns:wp14="http://schemas.microsoft.com/office/word/2010/wordprocessingDrawing" xmlns:wp="http://schemas.openxmlformats.org/drawingml/2006/wordprocessingDrawing" xmlns:w10="urn:schemas-microsoft-com:office:word" xmlns:w="http://schemas.openxmlformats.org/wordprocessingml/2006/main" xmlns:w14="http://schemas.microsoft.com/office/word/2010/wordml" xmlns:w15="http://schemas.microsoft.com/office/word/2012/wordml" xmlns:w16se="http://schemas.microsoft.com/office/word/2015/wordml/symex" xmlns:wpg="http://schemas.microsoft.com/office/word/2010/wordprocessingGroup" xmlns:wpi="http://schemas.microsoft.com/office/word/2010/wordprocessingInk" xmlns:wne="http://schemas.microsoft.com/office/word/2006/wordml" xmlns:wps="http://schemas.microsoft.com/office/word/2010/wordprocessingShape" mc:Ignorable="w14 w15 w16se wp14">
+  <w:abstractNum w:abstractNumId="0" w15:restartNumberingAfterBreak="0">
     <w:nsid w:val="0399270B"/>
     <w:multiLevelType w:val="multilevel"/>
     <w:tmpl w:val="F7A289AA"/>
@@ -3296,7 +3259,7 @@
       </w:rPr>
     </w:lvl>
   </w:abstractNum>
-  <w:abstractNum w:abstractNumId="1">
+  <w:abstractNum w:abstractNumId="1" w15:restartNumberingAfterBreak="0">
     <w:nsid w:val="120A3DB6"/>
     <w:multiLevelType w:val="multilevel"/>
     <w:tmpl w:val="4E52046A"/>
@@ -3445,7 +3408,7 @@
       </w:rPr>
     </w:lvl>
   </w:abstractNum>
-  <w:abstractNum w:abstractNumId="2">
+  <w:abstractNum w:abstractNumId="2" w15:restartNumberingAfterBreak="0">
     <w:nsid w:val="14E3005A"/>
     <w:multiLevelType w:val="hybridMultilevel"/>
     <w:tmpl w:val="9F3EC00E"/>
@@ -3535,7 +3498,7 @@
       </w:pPr>
     </w:lvl>
   </w:abstractNum>
-  <w:abstractNum w:abstractNumId="3">
+  <w:abstractNum w:abstractNumId="3" w15:restartNumberingAfterBreak="0">
     <w:nsid w:val="23744029"/>
     <w:multiLevelType w:val="multilevel"/>
     <w:tmpl w:val="4A60D9EA"/>
@@ -3684,7 +3647,7 @@
       </w:rPr>
     </w:lvl>
   </w:abstractNum>
-  <w:abstractNum w:abstractNumId="4">
+  <w:abstractNum w:abstractNumId="4" w15:restartNumberingAfterBreak="0">
     <w:nsid w:val="29073CAE"/>
     <w:multiLevelType w:val="multilevel"/>
     <w:tmpl w:val="4240FFE2"/>
@@ -3833,7 +3796,7 @@
       </w:rPr>
     </w:lvl>
   </w:abstractNum>
-  <w:abstractNum w:abstractNumId="5">
+  <w:abstractNum w:abstractNumId="5" w15:restartNumberingAfterBreak="0">
     <w:nsid w:val="2E3E3C2E"/>
     <w:multiLevelType w:val="multilevel"/>
     <w:tmpl w:val="06508692"/>
@@ -3982,7 +3945,7 @@
       </w:rPr>
     </w:lvl>
   </w:abstractNum>
-  <w:abstractNum w:abstractNumId="6">
+  <w:abstractNum w:abstractNumId="6" w15:restartNumberingAfterBreak="0">
     <w:nsid w:val="321F1409"/>
     <w:multiLevelType w:val="multilevel"/>
     <w:tmpl w:val="9E2EF288"/>
@@ -4131,7 +4094,7 @@
       </w:rPr>
     </w:lvl>
   </w:abstractNum>
-  <w:abstractNum w:abstractNumId="7">
+  <w:abstractNum w:abstractNumId="7" w15:restartNumberingAfterBreak="0">
     <w:nsid w:val="3BBA1FC8"/>
     <w:multiLevelType w:val="hybridMultilevel"/>
     <w:tmpl w:val="4404B5E8"/>
@@ -4220,7 +4183,7 @@
       </w:pPr>
     </w:lvl>
   </w:abstractNum>
-  <w:abstractNum w:abstractNumId="8">
+  <w:abstractNum w:abstractNumId="8" w15:restartNumberingAfterBreak="0">
     <w:nsid w:val="5094020F"/>
     <w:multiLevelType w:val="hybridMultilevel"/>
     <w:tmpl w:val="00E6C1AA"/>
@@ -4310,7 +4273,7 @@
       </w:pPr>
     </w:lvl>
   </w:abstractNum>
-  <w:abstractNum w:abstractNumId="9">
+  <w:abstractNum w:abstractNumId="9" w15:restartNumberingAfterBreak="0">
     <w:nsid w:val="517D618B"/>
     <w:multiLevelType w:val="multilevel"/>
     <w:tmpl w:val="DB6EC0DC"/>
@@ -4459,7 +4422,7 @@
       </w:rPr>
     </w:lvl>
   </w:abstractNum>
-  <w:abstractNum w:abstractNumId="10">
+  <w:abstractNum w:abstractNumId="10" w15:restartNumberingAfterBreak="0">
     <w:nsid w:val="5533562C"/>
     <w:multiLevelType w:val="multilevel"/>
     <w:tmpl w:val="3F0E7E28"/>
@@ -4608,7 +4571,7 @@
       </w:rPr>
     </w:lvl>
   </w:abstractNum>
-  <w:abstractNum w:abstractNumId="11">
+  <w:abstractNum w:abstractNumId="11" w15:restartNumberingAfterBreak="0">
     <w:nsid w:val="5A390CCF"/>
     <w:multiLevelType w:val="hybridMultilevel"/>
     <w:tmpl w:val="28B03C3E"/>
@@ -4698,7 +4661,7 @@
       </w:pPr>
     </w:lvl>
   </w:abstractNum>
-  <w:abstractNum w:abstractNumId="12">
+  <w:abstractNum w:abstractNumId="12" w15:restartNumberingAfterBreak="0">
     <w:nsid w:val="5CFA290A"/>
     <w:multiLevelType w:val="multilevel"/>
     <w:tmpl w:val="1C1CE05E"/>
@@ -4847,7 +4810,7 @@
       </w:rPr>
     </w:lvl>
   </w:abstractNum>
-  <w:abstractNum w:abstractNumId="13">
+  <w:abstractNum w:abstractNumId="13" w15:restartNumberingAfterBreak="0">
     <w:nsid w:val="5D6D62CC"/>
     <w:multiLevelType w:val="multilevel"/>
     <w:tmpl w:val="E774FDD4"/>
@@ -4996,7 +4959,7 @@
       </w:rPr>
     </w:lvl>
   </w:abstractNum>
-  <w:abstractNum w:abstractNumId="14">
+  <w:abstractNum w:abstractNumId="14" w15:restartNumberingAfterBreak="0">
     <w:nsid w:val="5EAD59E2"/>
     <w:multiLevelType w:val="multilevel"/>
     <w:tmpl w:val="E0106F78"/>
@@ -5145,7 +5108,7 @@
       </w:rPr>
     </w:lvl>
   </w:abstractNum>
-  <w:abstractNum w:abstractNumId="15">
+  <w:abstractNum w:abstractNumId="15" w15:restartNumberingAfterBreak="0">
     <w:nsid w:val="6B8A4920"/>
     <w:multiLevelType w:val="multilevel"/>
     <w:tmpl w:val="4D16B644"/>
@@ -5258,7 +5221,7 @@
       </w:rPr>
     </w:lvl>
   </w:abstractNum>
-  <w:abstractNum w:abstractNumId="16">
+  <w:abstractNum w:abstractNumId="16" w15:restartNumberingAfterBreak="0">
     <w:nsid w:val="6E5D245F"/>
     <w:multiLevelType w:val="hybridMultilevel"/>
     <w:tmpl w:val="D3A4E20C"/>
@@ -5347,7 +5310,7 @@
       </w:pPr>
     </w:lvl>
   </w:abstractNum>
-  <w:abstractNum w:abstractNumId="17">
+  <w:abstractNum w:abstractNumId="17" w15:restartNumberingAfterBreak="0">
     <w:nsid w:val="75825CA0"/>
     <w:multiLevelType w:val="hybridMultilevel"/>
     <w:tmpl w:val="41D0133A"/>
@@ -5518,7 +5481,7 @@
 </file>
 
 <file path=word/styles.xml><?xml version="1.0" encoding="utf-8"?>
-<w:styles xmlns:mc="http://schemas.openxmlformats.org/markup-compatibility/2006" xmlns:r="http://schemas.openxmlformats.org/officeDocument/2006/relationships" xmlns:w="http://schemas.openxmlformats.org/wordprocessingml/2006/main" xmlns:w14="http://schemas.microsoft.com/office/word/2010/wordml" xmlns:w15="http://schemas.microsoft.com/office/word/2012/wordml" mc:Ignorable="w14 w15">
+<w:styles xmlns:mc="http://schemas.openxmlformats.org/markup-compatibility/2006" xmlns:r="http://schemas.openxmlformats.org/officeDocument/2006/relationships" xmlns:w="http://schemas.openxmlformats.org/wordprocessingml/2006/main" xmlns:w14="http://schemas.microsoft.com/office/word/2010/wordml" xmlns:w15="http://schemas.microsoft.com/office/word/2012/wordml" xmlns:w16se="http://schemas.microsoft.com/office/word/2015/wordml/symex" mc:Ignorable="w14 w15 w16se">
   <w:docDefaults>
     <w:rPrDefault>
       <w:rPr>

</xml_diff>

<commit_message>
Security And Ergonomic Settings.docx
</commit_message>
<xml_diff>
--- a/Security And Ergonomic Settings.docx
+++ b/Security And Ergonomic Settings.docx
@@ -114,16 +114,7 @@
           <w:sz w:val="28"/>
           <w:szCs w:val="28"/>
         </w:rPr>
-        <w:t>In the context of modern digital collaboration, teams often rely heavily on online platforms such as cloud storage systems, version control tools, and communication applications. While these technologies increase productivity and convenience, they also introduce potential risks related to data</w:t>
-      </w:r>
-      <w:bookmarkStart w:id="0" w:name="_GoBack"/>
-      <w:bookmarkEnd w:id="0"/>
-      <w:r>
-        <w:rPr>
-          <w:sz w:val="28"/>
-          <w:szCs w:val="28"/>
-        </w:rPr>
-        <w:t xml:space="preserve"> breaches, unauthorized access, and misuse of information. Therefore, implementing robust security measures is essential to protect both individual and team data.</w:t>
+        <w:t>In the context of modern digital collaboration, teams often rely heavily on online platforms such as cloud storage systems, version control tools, and communication applications. While these technologies increase productivity and convenience, they also introduce potential risks related to data breaches, unauthorized access, and misuse of information. Therefore, implementing robust security measures is essential to protect both individual and team data.</w:t>
       </w:r>
     </w:p>
     <w:p>
@@ -3010,6 +3001,8 @@
         </w:rPr>
         <w:t>Supports collaborative problem-solving</w:t>
       </w:r>
+      <w:bookmarkStart w:id="0" w:name="_GoBack"/>
+      <w:bookmarkEnd w:id="0"/>
     </w:p>
     <w:p>
       <w:pPr>
@@ -3062,7 +3055,7 @@
           <w:sz w:val="28"/>
           <w:szCs w:val="28"/>
         </w:rPr>
-        <w:t>In conclusion, the integration of security measures, ethical practices, and digital health principles is essential for the success of the Digital Team Hub project. The implementation of 2FA and strict password policies significantly strengthens data protection and minimizes cybersecurity risks.</w:t>
+        <w:t>In conclusion, the success of the Digital Team Hub project relies on a strong foundation that combines robust security, ethical responsibility, and digital well-being. The adoption of two-factor authentication (2FA) alongside strict password policies plays a crucial role in safeguarding data and reducing cybersecurity risks.</w:t>
       </w:r>
     </w:p>
     <w:p>
@@ -3078,24 +3071,29 @@
           <w:sz w:val="28"/>
           <w:szCs w:val="28"/>
         </w:rPr>
-        <w:t>At the same time, the responsible use of AI ensures that technological tools are applied ethically and effectively, supporting both learning and productivity. Meanwhile, attention to ergonomics helps maintain physical well-being, reduce fatigue, and improve overall work performance.</w:t>
+        <w:t>Equally important is the responsible use of AI, ensuring that technological tools are applied in a transparent, ethical, and effective manner to enhance both learning and productivity. In parallel, a focus on ergonomics supports physical health, minimizes fatigue, and contributes to better overall performance.</w:t>
       </w:r>
     </w:p>
     <w:p>
       <w:pPr>
         <w:pStyle w:val="NormalWeb"/>
-        <w:rPr>
-          <w:sz w:val="28"/>
-          <w:szCs w:val="28"/>
-        </w:rPr>
-      </w:pPr>
-      <w:r>
-        <w:rPr>
-          <w:sz w:val="28"/>
-          <w:szCs w:val="28"/>
-        </w:rPr>
-        <w:t>These combined efforts create a well-balanced working environment where team members feel secure, supported, and motivated. As a result, collaboration becomes more effective, productivity increases, and the project achieves sustainable long-term success.</w:t>
-      </w:r>
+      </w:pPr>
+      <w:r>
+        <w:rPr>
+          <w:sz w:val="28"/>
+          <w:szCs w:val="28"/>
+        </w:rPr>
+        <w:t>Together, these elements foster a balanced and supportive working environment where team members feel secure, empowered, and motivated. This not only strengthens collaboration and boosts productivity but also drives the project toward sustainable, long-term success.</w:t>
+      </w:r>
+    </w:p>
+    <w:p>
+      <w:pPr>
+        <w:pStyle w:val="NormalWeb"/>
+        <w:rPr>
+          <w:sz w:val="28"/>
+          <w:szCs w:val="28"/>
+        </w:rPr>
+      </w:pPr>
     </w:p>
     <w:p>
       <w:pPr>
@@ -6021,7 +6019,6 @@
     <w:name w:val="Normal (Web)"/>
     <w:basedOn w:val="Normal"/>
     <w:uiPriority w:val="99"/>
-    <w:semiHidden/>
     <w:unhideWhenUsed/>
     <w:rsid w:val="00311751"/>
     <w:pPr>

</xml_diff>